<commit_message>
chore: update contract cover templates
</commit_message>
<xml_diff>
--- a/storage/app/templates/cover_kontrak_am.docx
+++ b/storage/app/templates/cover_kontrak_am.docx
@@ -2,619 +2,401 @@
 <file path=word/document.xml><?xml version="1.0" encoding="utf-8"?>
 <w:document xmlns:wpc="http://schemas.microsoft.com/office/word/2010/wordprocessingCanvas" xmlns:cx="http://schemas.microsoft.com/office/drawing/2014/chartex" xmlns:cx1="http://schemas.microsoft.com/office/drawing/2015/9/8/chartex" xmlns:cx2="http://schemas.microsoft.com/office/drawing/2015/10/21/chartex" xmlns:cx3="http://schemas.microsoft.com/office/drawing/2016/5/9/chartex" xmlns:cx4="http://schemas.microsoft.com/office/drawing/2016/5/10/chartex" xmlns:cx5="http://schemas.microsoft.com/office/drawing/2016/5/11/chartex" xmlns:cx6="http://schemas.microsoft.com/office/drawing/2016/5/12/chartex" xmlns:cx7="http://schemas.microsoft.com/office/drawing/2016/5/13/chartex" xmlns:cx8="http://schemas.microsoft.com/office/drawing/2016/5/14/chartex" xmlns:mc="http://schemas.openxmlformats.org/markup-compatibility/2006" xmlns:aink="http://schemas.microsoft.com/office/drawing/2016/ink" xmlns:am3d="http://schemas.microsoft.com/office/drawing/2017/model3d" xmlns:o="urn:schemas-microsoft-com:office:office" xmlns:oel="http://schemas.microsoft.com/office/2019/extlst" xmlns:r="http://schemas.openxmlformats.org/officeDocument/2006/relationships" xmlns:m="http://schemas.openxmlformats.org/officeDocument/2006/math" xmlns:v="urn:schemas-microsoft-com:vml" xmlns:wp14="http://schemas.microsoft.com/office/word/2010/wordprocessingDrawing" xmlns:wp="http://schemas.openxmlformats.org/drawingml/2006/wordprocessingDrawing" xmlns:w10="urn:schemas-microsoft-com:office:word" xmlns:w="http://schemas.openxmlformats.org/wordprocessingml/2006/main" xmlns:w14="http://schemas.microsoft.com/office/word/2010/wordml" xmlns:w15="http://schemas.microsoft.com/office/word/2012/wordml" xmlns:w16cex="http://schemas.microsoft.com/office/word/2018/wordml/cex" xmlns:w16cid="http://schemas.microsoft.com/office/word/2016/wordml/cid" xmlns:w16="http://schemas.microsoft.com/office/word/2018/wordml" xmlns:w16du="http://schemas.microsoft.com/office/word/2023/wordml/word16du" xmlns:w16sdtdh="http://schemas.microsoft.com/office/word/2020/wordml/sdtdatahash" xmlns:w16sdtfl="http://schemas.microsoft.com/office/word/2024/wordml/sdtformatlock" xmlns:w16se="http://schemas.microsoft.com/office/word/2015/wordml/symex" xmlns:wpg="http://schemas.microsoft.com/office/word/2010/wordprocessingGroup" xmlns:wpi="http://schemas.microsoft.com/office/word/2010/wordprocessingInk" xmlns:wne="http://schemas.microsoft.com/office/word/2006/wordml" xmlns:wps="http://schemas.microsoft.com/office/word/2010/wordprocessingShape" mc:Ignorable="w14 w15 w16se w16cid w16 w16cex w16sdtdh w16sdtfl w16du wp14">
   <w:body>
-    <w:tbl>
-      <w:tblPr>
-        <w:tblStyle w:val="TableGrid"/>
-        <w:tblpPr w:leftFromText="180" w:rightFromText="180" w:vertAnchor="page" w:horzAnchor="margin" w:tblpXSpec="center" w:tblpY="12931"/>
-        <w:tblW w:w="10416" w:type="dxa"/>
-        <w:tblBorders>
-          <w:top w:val="none" w:sz="0" w:space="0" w:color="auto"/>
-          <w:left w:val="none" w:sz="0" w:space="0" w:color="auto"/>
-          <w:bottom w:val="none" w:sz="0" w:space="0" w:color="auto"/>
-          <w:right w:val="none" w:sz="0" w:space="0" w:color="auto"/>
-          <w:insideH w:val="none" w:sz="0" w:space="0" w:color="auto"/>
-          <w:insideV w:val="none" w:sz="0" w:space="0" w:color="auto"/>
-        </w:tblBorders>
-        <w:tblLook w:val="04A0" w:firstRow="1" w:lastRow="0" w:firstColumn="1" w:lastColumn="0" w:noHBand="0" w:noVBand="1"/>
-      </w:tblPr>
-      <w:tblGrid>
-        <w:gridCol w:w="3796"/>
-        <w:gridCol w:w="371"/>
-        <w:gridCol w:w="6249"/>
-      </w:tblGrid>
-      <w:tr>
-        <w:trPr>
-          <w:trHeight w:val="458"/>
-        </w:trPr>
-        <w:tc>
-          <w:tcPr>
-            <w:tcW w:w="3796" w:type="dxa"/>
-          </w:tcPr>
-          <w:p>
-            <w:pPr>
-              <w:rPr>
-                <w:rFonts w:ascii="Arial Nova" w:hAnsi="Arial Nova" w:cs="Cascadia Mono"/>
-                <w:b/>
-                <w:bCs/>
-              </w:rPr>
-            </w:pPr>
-            <w:r>
-              <w:rPr>
-                <w:rFonts w:ascii="Arial Nova" w:hAnsi="Arial Nova" w:cs="Cascadia Mono"/>
-                <w:b/>
-                <w:bCs/>
-              </w:rPr>
-              <w:t>Paket Pekerjaan</w:t>
-            </w:r>
-          </w:p>
-        </w:tc>
-        <w:tc>
-          <w:tcPr>
-            <w:tcW w:w="371" w:type="dxa"/>
-          </w:tcPr>
-          <w:p>
-            <w:pPr>
-              <w:rPr>
-                <w:rFonts w:ascii="Arial Nova" w:hAnsi="Arial Nova" w:cs="Cascadia Mono"/>
-                <w:b/>
-                <w:bCs/>
-              </w:rPr>
-            </w:pPr>
-            <w:r>
-              <w:rPr>
-                <w:rFonts w:ascii="Arial Nova" w:hAnsi="Arial Nova" w:cs="Cascadia Mono"/>
-                <w:b/>
-                <w:bCs/>
-              </w:rPr>
-              <w:t>:</w:t>
-            </w:r>
-          </w:p>
-        </w:tc>
-        <w:tc>
-          <w:tcPr>
-            <w:tcW w:w="6249" w:type="dxa"/>
-          </w:tcPr>
-          <w:p>
-            <w:pPr>
-              <w:rPr>
-                <w:rFonts w:ascii="Arial Nova" w:hAnsi="Arial Nova" w:cs="Cascadia Mono"/>
-                <w:b/>
-                <w:bCs/>
-              </w:rPr>
-            </w:pPr>
-            <w:r>
-              <w:rPr>
-                <w:rFonts w:ascii="Arial Nova" w:hAnsi="Arial Nova" w:cs="Cascadia Mono"/>
-                <w:b/>
-                <w:bCs/>
-              </w:rPr>
-              <w:t>{nama_paket}</w:t>
-            </w:r>
-          </w:p>
-        </w:tc>
-      </w:tr>
-      <w:tr>
-        <w:trPr>
-          <w:trHeight w:val="458"/>
-        </w:trPr>
-        <w:tc>
-          <w:tcPr>
-            <w:tcW w:w="3796" w:type="dxa"/>
-          </w:tcPr>
-          <w:p>
-            <w:pPr>
-              <w:rPr>
-                <w:rFonts w:ascii="Arial Nova" w:hAnsi="Arial Nova" w:cs="Cascadia Mono"/>
-                <w:b/>
-                <w:bCs/>
-              </w:rPr>
-            </w:pPr>
-            <w:r>
-              <w:rPr>
-                <w:rFonts w:ascii="Arial Nova" w:hAnsi="Arial Nova" w:cs="Cascadia Mono"/>
-                <w:b/>
-                <w:bCs/>
-              </w:rPr>
-              <w:t>Nomor dan Tanggal Kontrak</w:t>
-            </w:r>
-          </w:p>
-        </w:tc>
-        <w:tc>
-          <w:tcPr>
-            <w:tcW w:w="371" w:type="dxa"/>
-          </w:tcPr>
-          <w:p>
-            <w:pPr>
-              <w:rPr>
-                <w:rFonts w:ascii="Arial Nova" w:hAnsi="Arial Nova" w:cs="Cascadia Mono"/>
-                <w:b/>
-                <w:bCs/>
-              </w:rPr>
-            </w:pPr>
-            <w:r>
-              <w:rPr>
-                <w:rFonts w:ascii="Arial Nova" w:hAnsi="Arial Nova" w:cs="Cascadia Mono"/>
-                <w:b/>
-                <w:bCs/>
-              </w:rPr>
-              <w:t>:</w:t>
-            </w:r>
-          </w:p>
-        </w:tc>
-        <w:tc>
-          <w:tcPr>
-            <w:tcW w:w="6249" w:type="dxa"/>
-          </w:tcPr>
-          <w:p>
-            <w:pPr>
-              <w:rPr>
-                <w:rFonts w:ascii="Arial Nova" w:hAnsi="Arial Nova" w:cs="Cascadia Mono"/>
-                <w:b/>
-                <w:bCs/>
-              </w:rPr>
-            </w:pPr>
-            <w:r>
-              <w:rPr>
-                <w:rFonts w:ascii="Arial Nova" w:hAnsi="Arial Nova" w:cs="Cascadia Mono"/>
-                <w:b/>
-                <w:bCs/>
-              </w:rPr>
-              <w:t>{nomor_spk} {tanggal_spk}</w:t>
-            </w:r>
-          </w:p>
-        </w:tc>
-      </w:tr>
-      <w:tr>
-        <w:trPr>
-          <w:trHeight w:val="458"/>
-        </w:trPr>
-        <w:tc>
-          <w:tcPr>
-            <w:tcW w:w="3796" w:type="dxa"/>
-          </w:tcPr>
-          <w:p>
-            <w:pPr>
-              <w:rPr>
-                <w:rFonts w:ascii="Arial Nova" w:hAnsi="Arial Nova" w:cs="Cascadia Mono"/>
-                <w:b/>
-                <w:bCs/>
-              </w:rPr>
-            </w:pPr>
-            <w:r>
-              <w:rPr>
-                <w:rFonts w:ascii="Arial Nova" w:hAnsi="Arial Nova" w:cs="Cascadia Mono"/>
-                <w:b/>
-                <w:bCs/>
-              </w:rPr>
-              <w:t>Masa Pelaksanaan</w:t>
-            </w:r>
-          </w:p>
-        </w:tc>
-        <w:tc>
-          <w:tcPr>
-            <w:tcW w:w="371" w:type="dxa"/>
-          </w:tcPr>
-          <w:p>
-            <w:pPr>
-              <w:rPr>
-                <w:rFonts w:ascii="Arial Nova" w:hAnsi="Arial Nova" w:cs="Cascadia Mono"/>
-                <w:b/>
-                <w:bCs/>
-              </w:rPr>
-            </w:pPr>
-            <w:r>
-              <w:rPr>
-                <w:rFonts w:ascii="Arial Nova" w:hAnsi="Arial Nova" w:cs="Cascadia Mono"/>
-                <w:b/>
-                <w:bCs/>
-              </w:rPr>
-              <w:t>:</w:t>
-            </w:r>
-          </w:p>
-        </w:tc>
-        <w:tc>
-          <w:tcPr>
-            <w:tcW w:w="6249" w:type="dxa"/>
-          </w:tcPr>
-          <w:p>
-            <w:pPr>
-              <w:rPr>
-                <w:rFonts w:ascii="Arial Nova" w:hAnsi="Arial Nova" w:cs="Cascadia Mono"/>
-                <w:b/>
-                <w:bCs/>
-              </w:rPr>
-            </w:pPr>
-            <w:r>
-              <w:rPr>
-                <w:rFonts w:ascii="Arial Nova" w:hAnsi="Arial Nova" w:cs="Cascadia Mono"/>
-                <w:b/>
-                <w:bCs/>
-              </w:rPr>
-              <w:t>{tanggal_mulai} – {tanggal_selesai} {masa} Hari Kalender</w:t>
-            </w:r>
-          </w:p>
-        </w:tc>
-      </w:tr>
-      <w:tr>
-        <w:trPr>
-          <w:trHeight w:val="407"/>
-        </w:trPr>
-        <w:tc>
-          <w:tcPr>
-            <w:tcW w:w="3796" w:type="dxa"/>
-          </w:tcPr>
-          <w:p>
-            <w:pPr>
-              <w:rPr>
-                <w:rFonts w:ascii="Arial Nova" w:hAnsi="Arial Nova" w:cs="Cascadia Mono"/>
-                <w:b/>
-                <w:bCs/>
-              </w:rPr>
-            </w:pPr>
-            <w:r>
-              <w:rPr>
-                <w:rFonts w:ascii="Arial Nova" w:hAnsi="Arial Nova" w:cs="Cascadia Mono"/>
-                <w:b/>
-                <w:bCs/>
-              </w:rPr>
-              <w:t>Nilai Kontrak</w:t>
-            </w:r>
-          </w:p>
-        </w:tc>
-        <w:tc>
-          <w:tcPr>
-            <w:tcW w:w="371" w:type="dxa"/>
-          </w:tcPr>
-          <w:p>
-            <w:pPr>
-              <w:rPr>
-                <w:rFonts w:ascii="Arial Nova" w:hAnsi="Arial Nova" w:cs="Cascadia Mono"/>
-                <w:b/>
-                <w:bCs/>
-              </w:rPr>
-            </w:pPr>
-            <w:r>
-              <w:rPr>
-                <w:rFonts w:ascii="Arial Nova" w:hAnsi="Arial Nova" w:cs="Cascadia Mono"/>
-                <w:b/>
-                <w:bCs/>
-              </w:rPr>
-              <w:t>:</w:t>
-            </w:r>
-          </w:p>
-        </w:tc>
-        <w:tc>
-          <w:tcPr>
-            <w:tcW w:w="6249" w:type="dxa"/>
-          </w:tcPr>
-          <w:p>
-            <w:pPr>
-              <w:rPr>
-                <w:rFonts w:ascii="Arial Nova" w:hAnsi="Arial Nova" w:cs="Cascadia Mono"/>
-                <w:b/>
-                <w:bCs/>
-              </w:rPr>
-            </w:pPr>
-            <w:r>
-              <w:rPr>
-                <w:rFonts w:ascii="Arial Nova" w:hAnsi="Arial Nova" w:cs="Cascadia Mono"/>
-                <w:b/>
-                <w:bCs/>
-              </w:rPr>
-              <w:t>{nilai_kontrak}</w:t>
-            </w:r>
-          </w:p>
-        </w:tc>
-      </w:tr>
-      <w:tr>
-        <w:trPr>
-          <w:trHeight w:val="458"/>
-        </w:trPr>
-        <w:tc>
-          <w:tcPr>
-            <w:tcW w:w="3796" w:type="dxa"/>
-          </w:tcPr>
-          <w:p>
-            <w:pPr>
-              <w:rPr>
-                <w:rFonts w:ascii="Arial Nova" w:hAnsi="Arial Nova" w:cs="Cascadia Mono"/>
-                <w:b/>
-                <w:bCs/>
-              </w:rPr>
-            </w:pPr>
-            <w:r>
-              <w:rPr>
-                <w:rFonts w:ascii="Arial Nova" w:hAnsi="Arial Nova" w:cs="Cascadia Mono"/>
-                <w:b/>
-                <w:bCs/>
-              </w:rPr>
-              <w:t>Terbilang</w:t>
-            </w:r>
-          </w:p>
-        </w:tc>
-        <w:tc>
-          <w:tcPr>
-            <w:tcW w:w="371" w:type="dxa"/>
-          </w:tcPr>
-          <w:p>
-            <w:pPr>
-              <w:rPr>
-                <w:rFonts w:ascii="Arial Nova" w:hAnsi="Arial Nova" w:cs="Cascadia Mono"/>
-                <w:b/>
-                <w:bCs/>
-              </w:rPr>
-            </w:pPr>
-            <w:r>
-              <w:rPr>
-                <w:rFonts w:ascii="Arial Nova" w:hAnsi="Arial Nova" w:cs="Cascadia Mono"/>
-                <w:b/>
-                <w:bCs/>
-              </w:rPr>
-              <w:t>:</w:t>
-            </w:r>
-          </w:p>
-        </w:tc>
-        <w:tc>
-          <w:tcPr>
-            <w:tcW w:w="6249" w:type="dxa"/>
-          </w:tcPr>
-          <w:p>
-            <w:pPr>
-              <w:rPr>
-                <w:rFonts w:ascii="Arial Nova" w:hAnsi="Arial Nova" w:cs="Cascadia Mono"/>
-                <w:b/>
-                <w:bCs/>
-              </w:rPr>
-            </w:pPr>
-            <w:r>
-              <w:rPr>
-                <w:rFonts w:ascii="Arial Nova" w:hAnsi="Arial Nova" w:cs="Cascadia Mono"/>
-                <w:b/>
-                <w:bCs/>
-              </w:rPr>
-              <w:t>{terbilang_nilai_kontrak}</w:t>
-            </w:r>
-          </w:p>
-        </w:tc>
-      </w:tr>
-      <w:tr>
-        <w:trPr>
-          <w:trHeight w:val="458"/>
-        </w:trPr>
-        <w:tc>
-          <w:tcPr>
-            <w:tcW w:w="3796" w:type="dxa"/>
-          </w:tcPr>
-          <w:p>
-            <w:pPr>
-              <w:rPr>
-                <w:rFonts w:ascii="Arial Nova" w:hAnsi="Arial Nova" w:cs="Cascadia Mono"/>
-                <w:b/>
-                <w:bCs/>
-              </w:rPr>
-            </w:pPr>
-            <w:r>
-              <w:rPr>
-                <w:rFonts w:ascii="Arial Nova" w:hAnsi="Arial Nova" w:cs="Cascadia Mono"/>
-                <w:b/>
-                <w:bCs/>
-              </w:rPr>
-              <w:t>Sumber Dana</w:t>
-            </w:r>
-          </w:p>
-        </w:tc>
-        <w:tc>
-          <w:tcPr>
-            <w:tcW w:w="371" w:type="dxa"/>
-          </w:tcPr>
-          <w:p>
-            <w:pPr>
-              <w:rPr>
-                <w:rFonts w:ascii="Arial Nova" w:hAnsi="Arial Nova" w:cs="Cascadia Mono"/>
-                <w:b/>
-                <w:bCs/>
-              </w:rPr>
-            </w:pPr>
-            <w:r>
-              <w:rPr>
-                <w:rFonts w:ascii="Arial Nova" w:hAnsi="Arial Nova" w:cs="Cascadia Mono"/>
-                <w:b/>
-                <w:bCs/>
-              </w:rPr>
-              <w:t>:</w:t>
-            </w:r>
-          </w:p>
-        </w:tc>
-        <w:tc>
-          <w:tcPr>
-            <w:tcW w:w="6249" w:type="dxa"/>
-          </w:tcPr>
-          <w:p>
-            <w:pPr>
-              <w:rPr>
-                <w:rFonts w:ascii="Arial Nova" w:hAnsi="Arial Nova" w:cs="Cascadia Mono"/>
-                <w:b/>
-                <w:bCs/>
-              </w:rPr>
-            </w:pPr>
-            <w:r>
-              <w:rPr>
-                <w:rFonts w:ascii="Arial Nova" w:hAnsi="Arial Nova" w:cs="Cascadia Mono"/>
-                <w:b/>
-                <w:bCs/>
-              </w:rPr>
-              <w:t>{sumber_dana}</w:t>
-            </w:r>
-          </w:p>
-        </w:tc>
-      </w:tr>
-      <w:tr>
-        <w:trPr>
-          <w:trHeight w:val="458"/>
-        </w:trPr>
-        <w:tc>
-          <w:tcPr>
-            <w:tcW w:w="3796" w:type="dxa"/>
-          </w:tcPr>
-          <w:p>
-            <w:pPr>
-              <w:rPr>
-                <w:rFonts w:ascii="Arial Nova" w:hAnsi="Arial Nova" w:cs="Cascadia Mono"/>
-                <w:b/>
-                <w:bCs/>
-              </w:rPr>
-            </w:pPr>
-            <w:r>
-              <w:rPr>
-                <w:rFonts w:ascii="Arial Nova" w:hAnsi="Arial Nova" w:cs="Cascadia Mono"/>
-                <w:b/>
-                <w:bCs/>
-              </w:rPr>
-              <w:t>Tahun Anggaran</w:t>
-            </w:r>
-          </w:p>
-        </w:tc>
-        <w:tc>
-          <w:tcPr>
-            <w:tcW w:w="371" w:type="dxa"/>
-          </w:tcPr>
-          <w:p>
-            <w:pPr>
-              <w:rPr>
-                <w:rFonts w:ascii="Arial Nova" w:hAnsi="Arial Nova" w:cs="Cascadia Mono"/>
-                <w:b/>
-                <w:bCs/>
-              </w:rPr>
-            </w:pPr>
-            <w:r>
-              <w:rPr>
-                <w:rFonts w:ascii="Arial Nova" w:hAnsi="Arial Nova" w:cs="Cascadia Mono"/>
-                <w:b/>
-                <w:bCs/>
-              </w:rPr>
-              <w:t>:</w:t>
-            </w:r>
-          </w:p>
-        </w:tc>
-        <w:tc>
-          <w:tcPr>
-            <w:tcW w:w="6249" w:type="dxa"/>
-          </w:tcPr>
-          <w:p>
-            <w:pPr>
-              <w:rPr>
-                <w:rFonts w:ascii="Arial Nova" w:hAnsi="Arial Nova" w:cs="Cascadia Mono"/>
-                <w:b/>
-                <w:bCs/>
-              </w:rPr>
-            </w:pPr>
-            <w:r>
-              <w:rPr>
-                <w:rFonts w:ascii="Arial Nova" w:hAnsi="Arial Nova" w:cs="Cascadia Mono"/>
-                <w:b/>
-                <w:bCs/>
-              </w:rPr>
-              <w:t>2026</w:t>
-            </w:r>
-          </w:p>
-        </w:tc>
-      </w:tr>
-      <w:tr>
-        <w:trPr>
-          <w:trHeight w:val="458"/>
-        </w:trPr>
-        <w:tc>
-          <w:tcPr>
-            <w:tcW w:w="3796" w:type="dxa"/>
-          </w:tcPr>
-          <w:p>
-            <w:pPr>
-              <w:rPr>
-                <w:rFonts w:ascii="Arial Nova" w:hAnsi="Arial Nova" w:cs="Cascadia Mono"/>
-                <w:b/>
-                <w:bCs/>
-              </w:rPr>
-            </w:pPr>
-            <w:r>
-              <w:rPr>
-                <w:rFonts w:ascii="Arial Nova" w:hAnsi="Arial Nova" w:cs="Cascadia Mono"/>
-                <w:b/>
-                <w:bCs/>
-              </w:rPr>
-              <w:t>Penyedia Jasa</w:t>
-            </w:r>
-          </w:p>
-        </w:tc>
-        <w:tc>
-          <w:tcPr>
-            <w:tcW w:w="371" w:type="dxa"/>
-          </w:tcPr>
-          <w:p>
-            <w:pPr>
-              <w:rPr>
-                <w:rFonts w:ascii="Arial Nova" w:hAnsi="Arial Nova" w:cs="Cascadia Mono"/>
-                <w:b/>
-                <w:bCs/>
-              </w:rPr>
-            </w:pPr>
-            <w:r>
-              <w:rPr>
-                <w:rFonts w:ascii="Arial Nova" w:hAnsi="Arial Nova" w:cs="Cascadia Mono"/>
-                <w:b/>
-                <w:bCs/>
-              </w:rPr>
-              <w:t>:</w:t>
-            </w:r>
-          </w:p>
-        </w:tc>
-        <w:tc>
-          <w:tcPr>
-            <w:tcW w:w="6249" w:type="dxa"/>
-          </w:tcPr>
-          <w:p>
-            <w:pPr>
-              <w:rPr>
-                <w:rFonts w:ascii="Arial Nova" w:hAnsi="Arial Nova" w:cs="Cascadia Mono"/>
-                <w:b/>
-                <w:bCs/>
-              </w:rPr>
-            </w:pPr>
-            <w:r>
-              <w:rPr>
-                <w:rFonts w:ascii="Arial Nova" w:hAnsi="Arial Nova" w:cs="Cascadia Mono"/>
-                <w:b/>
-                <w:bCs/>
-              </w:rPr>
-              <w:t>{nama_penyedia}</w:t>
-            </w:r>
-          </w:p>
-        </w:tc>
-      </w:tr>
-    </w:tbl>
     <w:p>
       <w:r>
         <w:rPr>
           <w:noProof/>
         </w:rPr>
-        <w:t xml:space="preserve"> </w:t>
+        <mc:AlternateContent>
+          <mc:Choice Requires="wps">
+            <w:drawing>
+              <wp:anchor distT="0" distB="0" distL="114300" distR="114300" simplePos="0" relativeHeight="251667456" behindDoc="0" locked="0" layoutInCell="1" allowOverlap="1" wp14:anchorId="52AE5261" wp14:editId="6BA7E30E">
+                <wp:simplePos x="0" y="0"/>
+                <wp:positionH relativeFrom="column">
+                  <wp:posOffset>-598227</wp:posOffset>
+                </wp:positionH>
+                <wp:positionV relativeFrom="paragraph">
+                  <wp:posOffset>7897505</wp:posOffset>
+                </wp:positionV>
+                <wp:extent cx="3930309" cy="573206"/>
+                <wp:effectExtent l="0" t="0" r="13335" b="17780"/>
+                <wp:wrapNone/>
+                <wp:docPr id="1436191616" name="Text Box 4"/>
+                <wp:cNvGraphicFramePr/>
+                <a:graphic xmlns:a="http://schemas.openxmlformats.org/drawingml/2006/main">
+                  <a:graphicData uri="http://schemas.microsoft.com/office/word/2010/wordprocessingShape">
+                    <wps:wsp>
+                      <wps:cNvSpPr txBox="1"/>
+                      <wps:spPr>
+                        <a:xfrm>
+                          <a:off x="0" y="0"/>
+                          <a:ext cx="3930309" cy="573206"/>
+                        </a:xfrm>
+                        <a:prstGeom prst="rect">
+                          <a:avLst/>
+                        </a:prstGeom>
+                        <a:solidFill>
+                          <a:schemeClr val="lt1"/>
+                        </a:solidFill>
+                        <a:ln w="6350">
+                          <a:solidFill>
+                            <a:schemeClr val="bg1"/>
+                          </a:solidFill>
+                        </a:ln>
+                      </wps:spPr>
+                      <wps:txbx>
+                        <w:txbxContent>
+                          <w:p>
+                            <w:pPr>
+                              <w:rPr>
+                                <w:rFonts w:ascii="Open sans 1" w:hAnsi="Open sans 1"/>
+                                <w:b/>
+                                <w:bCs/>
+                                <w:color w:val="00B0F0"/>
+                                <w:sz w:val="36"/>
+                                <w:szCs w:val="36"/>
+                              </w:rPr>
+                            </w:pPr>
+                            <w:r>
+                              <w:rPr>
+                                <w:rFonts w:ascii="Open sans 1" w:hAnsi="Open sans 1"/>
+                                <w:b/>
+                                <w:bCs/>
+                                <w:color w:val="00B0F0"/>
+                                <w:sz w:val="36"/>
+                                <w:szCs w:val="36"/>
+                              </w:rPr>
+                              <w:t>{nama_</w:t>
+                            </w:r>
+                            <w:r>
+                              <w:rPr>
+                                <w:rFonts w:ascii="Open sans 1" w:hAnsi="Open sans 1"/>
+                                <w:b/>
+                                <w:bCs/>
+                                <w:color w:val="00B0F0"/>
+                                <w:sz w:val="36"/>
+                                <w:szCs w:val="36"/>
+                              </w:rPr>
+                              <w:t>penyedia</w:t>
+                            </w:r>
+                            <w:r>
+                              <w:rPr>
+                                <w:rFonts w:ascii="Open sans 1" w:hAnsi="Open sans 1"/>
+                                <w:b/>
+                                <w:bCs/>
+                                <w:color w:val="00B0F0"/>
+                                <w:sz w:val="36"/>
+                                <w:szCs w:val="36"/>
+                              </w:rPr>
+                              <w:t>}</w:t>
+                            </w:r>
+                          </w:p>
+                          <w:p/>
+                        </w:txbxContent>
+                      </wps:txbx>
+                      <wps:bodyPr rot="0" spcFirstLastPara="0" vertOverflow="overflow" horzOverflow="overflow" vert="horz" wrap="square" lIns="91440" tIns="45720" rIns="91440" bIns="45720" numCol="1" spcCol="0" rtlCol="0" fromWordArt="0" anchor="t" anchorCtr="0" forceAA="0" compatLnSpc="1">
+                        <a:prstTxWarp prst="textNoShape">
+                          <a:avLst/>
+                        </a:prstTxWarp>
+                        <a:noAutofit/>
+                      </wps:bodyPr>
+                    </wps:wsp>
+                  </a:graphicData>
+                </a:graphic>
+                <wp14:sizeRelH relativeFrom="margin">
+                  <wp14:pctWidth>0</wp14:pctWidth>
+                </wp14:sizeRelH>
+                <wp14:sizeRelV relativeFrom="margin">
+                  <wp14:pctHeight>0</wp14:pctHeight>
+                </wp14:sizeRelV>
+              </wp:anchor>
+            </w:drawing>
+          </mc:Choice>
+          <mc:Fallback>
+            <w:pict>
+              <v:shapetype w14:anchorId="52AE5261" id="_x0000_t202" coordsize="21600,21600" o:spt="202" path="m,l,21600r21600,l21600,xe">
+                <v:stroke joinstyle="miter"/>
+                <v:path gradientshapeok="t" o:connecttype="rect"/>
+              </v:shapetype>
+              <v:shape id="Text Box 4" o:spid="_x0000_s1026" type="#_x0000_t202" style="position:absolute;margin-left:-47.1pt;margin-top:621.85pt;width:309.45pt;height:45.15pt;z-index:251667456;visibility:visible;mso-wrap-style:square;mso-width-percent:0;mso-height-percent:0;mso-wrap-distance-left:9pt;mso-wrap-distance-top:0;mso-wrap-distance-right:9pt;mso-wrap-distance-bottom:0;mso-position-horizontal:absolute;mso-position-horizontal-relative:text;mso-position-vertical:absolute;mso-position-vertical-relative:text;mso-width-percent:0;mso-height-percent:0;mso-width-relative:margin;mso-height-relative:margin;v-text-anchor:top" o:gfxdata="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" fillcolor="white [3201]" strokecolor="white [3212]" strokeweight=".5pt">
+                <v:textbox>
+                  <w:txbxContent>
+                    <w:p>
+                      <w:pPr>
+                        <w:rPr>
+                          <w:rFonts w:ascii="Open sans 1" w:hAnsi="Open sans 1"/>
+                          <w:b/>
+                          <w:bCs/>
+                          <w:color w:val="00B0F0"/>
+                          <w:sz w:val="36"/>
+                          <w:szCs w:val="36"/>
+                        </w:rPr>
+                      </w:pPr>
+                      <w:r>
+                        <w:rPr>
+                          <w:rFonts w:ascii="Open sans 1" w:hAnsi="Open sans 1"/>
+                          <w:b/>
+                          <w:bCs/>
+                          <w:color w:val="00B0F0"/>
+                          <w:sz w:val="36"/>
+                          <w:szCs w:val="36"/>
+                        </w:rPr>
+                        <w:t>{nama_</w:t>
+                      </w:r>
+                      <w:r>
+                        <w:rPr>
+                          <w:rFonts w:ascii="Open sans 1" w:hAnsi="Open sans 1"/>
+                          <w:b/>
+                          <w:bCs/>
+                          <w:color w:val="00B0F0"/>
+                          <w:sz w:val="36"/>
+                          <w:szCs w:val="36"/>
+                        </w:rPr>
+                        <w:t>penyedia</w:t>
+                      </w:r>
+                      <w:r>
+                        <w:rPr>
+                          <w:rFonts w:ascii="Open sans 1" w:hAnsi="Open sans 1"/>
+                          <w:b/>
+                          <w:bCs/>
+                          <w:color w:val="00B0F0"/>
+                          <w:sz w:val="36"/>
+                          <w:szCs w:val="36"/>
+                        </w:rPr>
+                        <w:t>}</w:t>
+                      </w:r>
+                    </w:p>
+                    <w:p/>
+                  </w:txbxContent>
+                </v:textbox>
+              </v:shape>
+            </w:pict>
+          </mc:Fallback>
+        </mc:AlternateContent>
+      </w:r>
+      <w:r>
+        <w:rPr>
+          <w:noProof/>
+        </w:rPr>
+        <mc:AlternateContent>
+          <mc:Choice Requires="wps">
+            <w:drawing>
+              <wp:anchor distT="0" distB="0" distL="114300" distR="114300" simplePos="0" relativeHeight="251665408" behindDoc="0" locked="0" layoutInCell="1" allowOverlap="1" wp14:anchorId="4662B93B" wp14:editId="22BE85F3">
+                <wp:simplePos x="0" y="0"/>
+                <wp:positionH relativeFrom="column">
+                  <wp:posOffset>-598227</wp:posOffset>
+                </wp:positionH>
+                <wp:positionV relativeFrom="paragraph">
+                  <wp:posOffset>3434687</wp:posOffset>
+                </wp:positionV>
+                <wp:extent cx="3930309" cy="1514901"/>
+                <wp:effectExtent l="0" t="0" r="13335" b="28575"/>
+                <wp:wrapNone/>
+                <wp:docPr id="281399290" name="Text Box 4"/>
+                <wp:cNvGraphicFramePr/>
+                <a:graphic xmlns:a="http://schemas.openxmlformats.org/drawingml/2006/main">
+                  <a:graphicData uri="http://schemas.microsoft.com/office/word/2010/wordprocessingShape">
+                    <wps:wsp>
+                      <wps:cNvSpPr txBox="1"/>
+                      <wps:spPr>
+                        <a:xfrm>
+                          <a:off x="0" y="0"/>
+                          <a:ext cx="3930309" cy="1514901"/>
+                        </a:xfrm>
+                        <a:prstGeom prst="rect">
+                          <a:avLst/>
+                        </a:prstGeom>
+                        <a:solidFill>
+                          <a:schemeClr val="lt1"/>
+                        </a:solidFill>
+                        <a:ln w="6350">
+                          <a:solidFill>
+                            <a:schemeClr val="bg1"/>
+                          </a:solidFill>
+                        </a:ln>
+                      </wps:spPr>
+                      <wps:txbx>
+                        <w:txbxContent>
+                          <w:p>
+                            <w:pPr>
+                              <w:rPr>
+                                <w:rFonts w:ascii="Open sans 1" w:hAnsi="Open sans 1"/>
+                                <w:b/>
+                                <w:bCs/>
+                                <w:color w:val="00B0F0"/>
+                                <w:sz w:val="36"/>
+                                <w:szCs w:val="36"/>
+                              </w:rPr>
+                            </w:pPr>
+                            <w:r>
+                              <w:rPr>
+                                <w:rFonts w:ascii="Open sans 1" w:hAnsi="Open sans 1"/>
+                                <w:b/>
+                                <w:bCs/>
+                                <w:color w:val="00B0F0"/>
+                                <w:sz w:val="36"/>
+                                <w:szCs w:val="36"/>
+                              </w:rPr>
+                              <w:t>{nama_paket}</w:t>
+                            </w:r>
+                          </w:p>
+                          <w:p/>
+                        </w:txbxContent>
+                      </wps:txbx>
+                      <wps:bodyPr rot="0" spcFirstLastPara="0" vertOverflow="overflow" horzOverflow="overflow" vert="horz" wrap="square" lIns="91440" tIns="45720" rIns="91440" bIns="45720" numCol="1" spcCol="0" rtlCol="0" fromWordArt="0" anchor="t" anchorCtr="0" forceAA="0" compatLnSpc="1">
+                        <a:prstTxWarp prst="textNoShape">
+                          <a:avLst/>
+                        </a:prstTxWarp>
+                        <a:noAutofit/>
+                      </wps:bodyPr>
+                    </wps:wsp>
+                  </a:graphicData>
+                </a:graphic>
+                <wp14:sizeRelH relativeFrom="margin">
+                  <wp14:pctWidth>0</wp14:pctWidth>
+                </wp14:sizeRelH>
+                <wp14:sizeRelV relativeFrom="margin">
+                  <wp14:pctHeight>0</wp14:pctHeight>
+                </wp14:sizeRelV>
+              </wp:anchor>
+            </w:drawing>
+          </mc:Choice>
+          <mc:Fallback>
+            <w:pict>
+              <v:shape w14:anchorId="4662B93B" id="_x0000_s1027" type="#_x0000_t202" style="position:absolute;margin-left:-47.1pt;margin-top:270.45pt;width:309.45pt;height:119.3pt;z-index:251665408;visibility:visible;mso-wrap-style:square;mso-width-percent:0;mso-height-percent:0;mso-wrap-distance-left:9pt;mso-wrap-distance-top:0;mso-wrap-distance-right:9pt;mso-wrap-distance-bottom:0;mso-position-horizontal:absolute;mso-position-horizontal-relative:text;mso-position-vertical:absolute;mso-position-vertical-relative:text;mso-width-percent:0;mso-height-percent:0;mso-width-relative:margin;mso-height-relative:margin;v-text-anchor:top" o:gfxdata="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" fillcolor="white [3201]" strokecolor="white [3212]" strokeweight=".5pt">
+                <v:textbox>
+                  <w:txbxContent>
+                    <w:p>
+                      <w:pPr>
+                        <w:rPr>
+                          <w:rFonts w:ascii="Open sans 1" w:hAnsi="Open sans 1"/>
+                          <w:b/>
+                          <w:bCs/>
+                          <w:color w:val="00B0F0"/>
+                          <w:sz w:val="36"/>
+                          <w:szCs w:val="36"/>
+                        </w:rPr>
+                      </w:pPr>
+                      <w:r>
+                        <w:rPr>
+                          <w:rFonts w:ascii="Open sans 1" w:hAnsi="Open sans 1"/>
+                          <w:b/>
+                          <w:bCs/>
+                          <w:color w:val="00B0F0"/>
+                          <w:sz w:val="36"/>
+                          <w:szCs w:val="36"/>
+                        </w:rPr>
+                        <w:t>{nama_paket}</w:t>
+                      </w:r>
+                    </w:p>
+                    <w:p/>
+                  </w:txbxContent>
+                </v:textbox>
+              </v:shape>
+            </w:pict>
+          </mc:Fallback>
+        </mc:AlternateContent>
+      </w:r>
+      <w:r>
+        <mc:AlternateContent>
+          <mc:Choice Requires="wps">
+            <w:drawing>
+              <wp:anchor distT="0" distB="0" distL="114300" distR="114300" simplePos="0" relativeHeight="251664384" behindDoc="0" locked="0" layoutInCell="1" allowOverlap="1" wp14:anchorId="16772A74" wp14:editId="519D0FEC">
+                <wp:simplePos x="0" y="0"/>
+                <wp:positionH relativeFrom="column">
+                  <wp:posOffset>1503576</wp:posOffset>
+                </wp:positionH>
+                <wp:positionV relativeFrom="paragraph">
+                  <wp:posOffset>5154721</wp:posOffset>
+                </wp:positionV>
+                <wp:extent cx="8109495" cy="6384384"/>
+                <wp:effectExtent l="0" t="0" r="6350" b="0"/>
+                <wp:wrapNone/>
+                <wp:docPr id="5" name="Freeform 5"/>
+                <wp:cNvGraphicFramePr/>
+                <a:graphic xmlns:a="http://schemas.openxmlformats.org/drawingml/2006/main">
+                  <a:graphicData uri="http://schemas.microsoft.com/office/word/2010/wordprocessingShape">
+                    <wps:wsp>
+                      <wps:cNvSpPr/>
+                      <wps:spPr>
+                        <a:xfrm rot="10800000">
+                          <a:off x="0" y="0"/>
+                          <a:ext cx="8109495" cy="6384384"/>
+                        </a:xfrm>
+                        <a:custGeom>
+                          <a:avLst/>
+                          <a:gdLst/>
+                          <a:ahLst/>
+                          <a:cxnLst/>
+                          <a:rect l="l" t="t" r="r" b="b"/>
+                          <a:pathLst>
+                            <a:path w="8109495" h="6384384">
+                              <a:moveTo>
+                                <a:pt x="0" y="0"/>
+                              </a:moveTo>
+                              <a:lnTo>
+                                <a:pt x="8109494" y="0"/>
+                              </a:lnTo>
+                              <a:lnTo>
+                                <a:pt x="8109494" y="6384384"/>
+                              </a:lnTo>
+                              <a:lnTo>
+                                <a:pt x="0" y="6384384"/>
+                              </a:lnTo>
+                              <a:lnTo>
+                                <a:pt x="0" y="0"/>
+                              </a:lnTo>
+                              <a:close/>
+                            </a:path>
+                          </a:pathLst>
+                        </a:custGeom>
+                        <a:blipFill>
+                          <a:blip r:embed="rId4">
+                            <a:extLst>
+                              <a:ext uri="{96DAC541-7B7A-43D3-8B79-37D633B846F1}">
+                                <asvg:svgBlip xmlns:asvg="http://schemas.microsoft.com/office/drawing/2016/SVG/main" r:embed="rId5"/>
+                              </a:ext>
+                            </a:extLst>
+                          </a:blip>
+                          <a:stretch>
+                            <a:fillRect/>
+                          </a:stretch>
+                        </a:blipFill>
+                      </wps:spPr>
+                      <wps:bodyPr/>
+                    </wps:wsp>
+                  </a:graphicData>
+                </a:graphic>
+              </wp:anchor>
+            </w:drawing>
+          </mc:Choice>
+          <mc:Fallback>
+            <w:pict>
+              <v:shape w14:anchorId="3573E0AF" id="Freeform 5" o:spid="_x0000_s1026" style="position:absolute;margin-left:118.4pt;margin-top:405.9pt;width:638.55pt;height:502.7pt;rotation:180;z-index:251664384;visibility:visible;mso-wrap-style:square;mso-wrap-distance-left:9pt;mso-wrap-distance-top:0;mso-wrap-distance-right:9pt;mso-wrap-distance-bottom:0;mso-position-horizontal:absolute;mso-position-horizontal-relative:text;mso-position-vertical:absolute;mso-position-vertical-relative:text;v-text-anchor:top" coordsize="8109495,6384384" o:gfxdata="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" path="m,l8109494,r,6384384l,6384384,,xe" stroked="f">
+                <v:fill r:id="rId6" o:title="" recolor="t" rotate="t" type="frame"/>
+                <v:path arrowok="t"/>
+              </v:shape>
+            </w:pict>
+          </mc:Fallback>
+        </mc:AlternateContent>
       </w:r>
       <w:r>
         <w:rPr>
           <w:noProof/>
         </w:rPr>
         <w:drawing>
-          <wp:anchor distT="0" distB="0" distL="114300" distR="114300" simplePos="0" relativeHeight="251659264" behindDoc="1" locked="0" layoutInCell="1" allowOverlap="1" wp14:anchorId="07A0E1AF" wp14:editId="389F50C0">
+          <wp:anchor distT="0" distB="0" distL="114300" distR="114300" simplePos="0" relativeHeight="251662336" behindDoc="0" locked="0" layoutInCell="1" allowOverlap="1" wp14:anchorId="6A218DB0" wp14:editId="481AE5C9">
             <wp:simplePos x="0" y="0"/>
             <wp:positionH relativeFrom="column">
-              <wp:posOffset>-1498979</wp:posOffset>
+              <wp:posOffset>-1414704</wp:posOffset>
             </wp:positionH>
             <wp:positionV relativeFrom="paragraph">
-              <wp:posOffset>-1355678</wp:posOffset>
+              <wp:posOffset>-1382604</wp:posOffset>
             </wp:positionV>
-            <wp:extent cx="9203055" cy="13167626"/>
-            <wp:effectExtent l="0" t="0" r="0" b="0"/>
+            <wp:extent cx="8883558" cy="12569134"/>
+            <wp:effectExtent l="0" t="0" r="0" b="4445"/>
             <wp:wrapNone/>
-            <wp:docPr id="1892619755" name="Picture 1"/>
+            <wp:docPr id="2142788892" name="Picture 3"/>
             <wp:cNvGraphicFramePr>
               <a:graphicFrameLocks xmlns:a="http://schemas.openxmlformats.org/drawingml/2006/main" noChangeAspect="1"/>
             </wp:cNvGraphicFramePr>
@@ -622,11 +404,11 @@
               <a:graphicData uri="http://schemas.openxmlformats.org/drawingml/2006/picture">
                 <pic:pic xmlns:pic="http://schemas.openxmlformats.org/drawingml/2006/picture">
                   <pic:nvPicPr>
-                    <pic:cNvPr id="1892619755" name="Picture 1892619755"/>
+                    <pic:cNvPr id="2142788892" name="Picture 2142788892"/>
                     <pic:cNvPicPr/>
                   </pic:nvPicPr>
                   <pic:blipFill>
-                    <a:blip r:embed="rId4">
+                    <a:blip r:embed="rId7" cstate="print">
                       <a:extLst>
                         <a:ext uri="{28A0092B-C50C-407E-A947-70E740481C1C}">
                           <a14:useLocalDpi xmlns:a14="http://schemas.microsoft.com/office/drawing/2010/main" val="0"/>
@@ -640,7 +422,7 @@
                   <pic:spPr>
                     <a:xfrm>
                       <a:off x="0" y="0"/>
-                      <a:ext cx="9203653" cy="13168481"/>
+                      <a:ext cx="8883558" cy="12569134"/>
                     </a:xfrm>
                     <a:prstGeom prst="rect">
                       <a:avLst/>
@@ -659,16 +441,13 @@
         </w:drawing>
       </w:r>
       <w:r>
-        <w:rPr>
-          <w:noProof/>
-        </w:rPr>
-        <w:t xml:space="preserve"> </w:t>
+        <w:br w:type="page"/>
       </w:r>
     </w:p>
     <w:tbl>
       <w:tblPr>
         <w:tblStyle w:val="TableGrid"/>
-        <w:tblpPr w:leftFromText="180" w:rightFromText="180" w:vertAnchor="text" w:horzAnchor="margin" w:tblpY="5038"/>
+        <w:tblpPr w:leftFromText="180" w:rightFromText="180" w:vertAnchor="text" w:horzAnchor="margin" w:tblpY="-1188"/>
         <w:tblW w:w="9688" w:type="dxa"/>
         <w:tblBorders>
           <w:top w:val="none" w:sz="0" w:space="0" w:color="auto"/>
@@ -710,6 +489,7 @@
                 <w:sz w:val="36"/>
                 <w:szCs w:val="36"/>
               </w:rPr>
+              <w:lastRenderedPageBreak/>
               <w:t>PEKERJAAN:</w:t>
             </w:r>
           </w:p>
@@ -853,6 +633,605 @@
                 <w:rFonts w:ascii="Arial Rounded MT Bold" w:hAnsi="Arial Rounded MT Bold"/>
               </w:rPr>
             </w:pPr>
+          </w:p>
+        </w:tc>
+      </w:tr>
+    </w:tbl>
+    <w:p/>
+    <w:p>
+      <w:r>
+        <w:rPr>
+          <w:noProof/>
+        </w:rPr>
+        <w:t xml:space="preserve">  </w:t>
+      </w:r>
+    </w:p>
+    <w:tbl>
+      <w:tblPr>
+        <w:tblStyle w:val="TableGrid"/>
+        <w:tblpPr w:leftFromText="180" w:rightFromText="180" w:vertAnchor="page" w:horzAnchor="margin" w:tblpY="5697"/>
+        <w:tblW w:w="0" w:type="auto"/>
+        <w:tblBorders>
+          <w:top w:val="none" w:sz="0" w:space="0" w:color="auto"/>
+          <w:left w:val="none" w:sz="0" w:space="0" w:color="auto"/>
+          <w:bottom w:val="none" w:sz="0" w:space="0" w:color="auto"/>
+          <w:right w:val="none" w:sz="0" w:space="0" w:color="auto"/>
+          <w:insideH w:val="none" w:sz="0" w:space="0" w:color="auto"/>
+          <w:insideV w:val="none" w:sz="0" w:space="0" w:color="auto"/>
+        </w:tblBorders>
+        <w:tblLayout w:type="fixed"/>
+        <w:tblLook w:val="04A0" w:firstRow="1" w:lastRow="0" w:firstColumn="1" w:lastColumn="0" w:noHBand="0" w:noVBand="1"/>
+      </w:tblPr>
+      <w:tblGrid>
+        <w:gridCol w:w="3106"/>
+        <w:gridCol w:w="282"/>
+        <w:gridCol w:w="6058"/>
+      </w:tblGrid>
+      <w:tr>
+        <w:trPr>
+          <w:trHeight w:val="458"/>
+        </w:trPr>
+        <w:tc>
+          <w:tcPr>
+            <w:tcW w:w="3106" w:type="dxa"/>
+          </w:tcPr>
+          <w:p>
+            <w:pPr>
+              <w:rPr>
+                <w:rFonts w:ascii="Arial Nova" w:hAnsi="Arial Nova" w:cs="Cascadia Mono"/>
+                <w:b/>
+                <w:bCs/>
+              </w:rPr>
+            </w:pPr>
+            <w:r>
+              <w:rPr>
+                <w:rFonts w:ascii="Arial Nova" w:hAnsi="Arial Nova" w:cs="Cascadia Mono"/>
+                <w:b/>
+                <w:bCs/>
+              </w:rPr>
+              <w:t>Paket Pekerjaan</w:t>
+            </w:r>
+          </w:p>
+        </w:tc>
+        <w:tc>
+          <w:tcPr>
+            <w:tcW w:w="282" w:type="dxa"/>
+          </w:tcPr>
+          <w:p>
+            <w:pPr>
+              <w:rPr>
+                <w:rFonts w:ascii="Arial Nova" w:hAnsi="Arial Nova" w:cs="Cascadia Mono"/>
+                <w:b/>
+                <w:bCs/>
+              </w:rPr>
+            </w:pPr>
+            <w:r>
+              <w:rPr>
+                <w:rFonts w:ascii="Arial Nova" w:hAnsi="Arial Nova" w:cs="Cascadia Mono"/>
+                <w:b/>
+                <w:bCs/>
+              </w:rPr>
+              <w:t>:</w:t>
+            </w:r>
+          </w:p>
+        </w:tc>
+        <w:tc>
+          <w:tcPr>
+            <w:tcW w:w="6058" w:type="dxa"/>
+          </w:tcPr>
+          <w:p>
+            <w:pPr>
+              <w:rPr>
+                <w:rFonts w:ascii="Arial Nova" w:hAnsi="Arial Nova" w:cs="Cascadia Mono"/>
+                <w:b/>
+                <w:bCs/>
+              </w:rPr>
+            </w:pPr>
+            <w:r>
+              <w:rPr>
+                <w:rFonts w:ascii="Arial Nova" w:hAnsi="Arial Nova" w:cs="Cascadia Mono"/>
+                <w:b/>
+                <w:bCs/>
+              </w:rPr>
+              <w:t>{nama_paket}</w:t>
+            </w:r>
+          </w:p>
+        </w:tc>
+      </w:tr>
+      <w:tr>
+        <w:trPr>
+          <w:trHeight w:val="458"/>
+        </w:trPr>
+        <w:tc>
+          <w:tcPr>
+            <w:tcW w:w="3106" w:type="dxa"/>
+          </w:tcPr>
+          <w:p>
+            <w:pPr>
+              <w:rPr>
+                <w:rFonts w:ascii="Arial Nova" w:hAnsi="Arial Nova" w:cs="Cascadia Mono"/>
+                <w:b/>
+                <w:bCs/>
+              </w:rPr>
+            </w:pPr>
+            <w:r>
+              <w:rPr>
+                <w:rFonts w:ascii="Arial Nova" w:hAnsi="Arial Nova" w:cs="Cascadia Mono"/>
+                <w:b/>
+                <w:bCs/>
+              </w:rPr>
+              <w:t>Nomor dan Tanggal Kontrak</w:t>
+            </w:r>
+          </w:p>
+        </w:tc>
+        <w:tc>
+          <w:tcPr>
+            <w:tcW w:w="282" w:type="dxa"/>
+          </w:tcPr>
+          <w:p>
+            <w:pPr>
+              <w:rPr>
+                <w:rFonts w:ascii="Arial Nova" w:hAnsi="Arial Nova" w:cs="Cascadia Mono"/>
+                <w:b/>
+                <w:bCs/>
+              </w:rPr>
+            </w:pPr>
+            <w:r>
+              <w:rPr>
+                <w:rFonts w:ascii="Arial Nova" w:hAnsi="Arial Nova" w:cs="Cascadia Mono"/>
+                <w:b/>
+                <w:bCs/>
+              </w:rPr>
+              <w:t>:</w:t>
+            </w:r>
+          </w:p>
+        </w:tc>
+        <w:tc>
+          <w:tcPr>
+            <w:tcW w:w="6058" w:type="dxa"/>
+          </w:tcPr>
+          <w:p>
+            <w:pPr>
+              <w:rPr>
+                <w:rFonts w:ascii="Arial Nova" w:hAnsi="Arial Nova" w:cs="Cascadia Mono"/>
+                <w:b/>
+                <w:bCs/>
+              </w:rPr>
+            </w:pPr>
+            <w:r>
+              <w:rPr>
+                <w:rFonts w:ascii="Arial Nova" w:hAnsi="Arial Nova" w:cs="Cascadia Mono"/>
+                <w:b/>
+                <w:bCs/>
+              </w:rPr>
+              <w:t>{nomor_spk} {tanggal_spk}</w:t>
+            </w:r>
+          </w:p>
+        </w:tc>
+      </w:tr>
+      <w:tr>
+        <w:trPr>
+          <w:trHeight w:val="458"/>
+        </w:trPr>
+        <w:tc>
+          <w:tcPr>
+            <w:tcW w:w="3106" w:type="dxa"/>
+          </w:tcPr>
+          <w:p>
+            <w:pPr>
+              <w:rPr>
+                <w:rFonts w:ascii="Arial Nova" w:hAnsi="Arial Nova" w:cs="Cascadia Mono"/>
+                <w:b/>
+                <w:bCs/>
+              </w:rPr>
+            </w:pPr>
+            <w:r>
+              <w:rPr>
+                <w:rFonts w:ascii="Arial Nova" w:hAnsi="Arial Nova" w:cs="Cascadia Mono"/>
+                <w:b/>
+                <w:bCs/>
+              </w:rPr>
+              <w:t>Masa Pelaksanaan</w:t>
+            </w:r>
+          </w:p>
+        </w:tc>
+        <w:tc>
+          <w:tcPr>
+            <w:tcW w:w="282" w:type="dxa"/>
+          </w:tcPr>
+          <w:p>
+            <w:pPr>
+              <w:rPr>
+                <w:rFonts w:ascii="Arial Nova" w:hAnsi="Arial Nova" w:cs="Cascadia Mono"/>
+                <w:b/>
+                <w:bCs/>
+              </w:rPr>
+            </w:pPr>
+            <w:r>
+              <w:rPr>
+                <w:rFonts w:ascii="Arial Nova" w:hAnsi="Arial Nova" w:cs="Cascadia Mono"/>
+                <w:b/>
+                <w:bCs/>
+              </w:rPr>
+              <w:t>:</w:t>
+            </w:r>
+          </w:p>
+        </w:tc>
+        <w:tc>
+          <w:tcPr>
+            <w:tcW w:w="6058" w:type="dxa"/>
+          </w:tcPr>
+          <w:p>
+            <w:pPr>
+              <w:rPr>
+                <w:rFonts w:ascii="Arial Nova" w:hAnsi="Arial Nova" w:cs="Cascadia Mono"/>
+                <w:b/>
+                <w:bCs/>
+              </w:rPr>
+            </w:pPr>
+            <w:r>
+              <w:rPr>
+                <w:rFonts w:ascii="Arial Nova" w:hAnsi="Arial Nova" w:cs="Cascadia Mono"/>
+                <w:b/>
+                <w:bCs/>
+              </w:rPr>
+              <w:t>{tanggal_mulai} – {tanggal_selesai} {masa} Hari Kalender</w:t>
+            </w:r>
+          </w:p>
+        </w:tc>
+      </w:tr>
+      <w:tr>
+        <w:trPr>
+          <w:trHeight w:val="407"/>
+        </w:trPr>
+        <w:tc>
+          <w:tcPr>
+            <w:tcW w:w="3106" w:type="dxa"/>
+          </w:tcPr>
+          <w:p>
+            <w:pPr>
+              <w:rPr>
+                <w:rFonts w:ascii="Arial Nova" w:hAnsi="Arial Nova" w:cs="Cascadia Mono"/>
+                <w:b/>
+                <w:bCs/>
+              </w:rPr>
+            </w:pPr>
+            <w:r>
+              <w:rPr>
+                <w:rFonts w:ascii="Arial Nova" w:hAnsi="Arial Nova" w:cs="Cascadia Mono"/>
+                <w:b/>
+                <w:bCs/>
+              </w:rPr>
+              <w:t>Nilai Kontrak</w:t>
+            </w:r>
+          </w:p>
+        </w:tc>
+        <w:tc>
+          <w:tcPr>
+            <w:tcW w:w="282" w:type="dxa"/>
+          </w:tcPr>
+          <w:p>
+            <w:pPr>
+              <w:rPr>
+                <w:rFonts w:ascii="Arial Nova" w:hAnsi="Arial Nova" w:cs="Cascadia Mono"/>
+                <w:b/>
+                <w:bCs/>
+              </w:rPr>
+            </w:pPr>
+            <w:r>
+              <w:rPr>
+                <w:rFonts w:ascii="Arial Nova" w:hAnsi="Arial Nova" w:cs="Cascadia Mono"/>
+                <w:b/>
+                <w:bCs/>
+              </w:rPr>
+              <w:t>:</w:t>
+            </w:r>
+          </w:p>
+        </w:tc>
+        <w:tc>
+          <w:tcPr>
+            <w:tcW w:w="6058" w:type="dxa"/>
+          </w:tcPr>
+          <w:p>
+            <w:pPr>
+              <w:rPr>
+                <w:rFonts w:ascii="Arial Nova" w:hAnsi="Arial Nova" w:cs="Cascadia Mono"/>
+                <w:b/>
+                <w:bCs/>
+              </w:rPr>
+            </w:pPr>
+            <w:r>
+              <w:rPr>
+                <w:rFonts w:ascii="Arial Nova" w:hAnsi="Arial Nova" w:cs="Cascadia Mono"/>
+                <w:b/>
+                <w:bCs/>
+              </w:rPr>
+              <w:t>{nilai_kontrak}</w:t>
+            </w:r>
+          </w:p>
+        </w:tc>
+      </w:tr>
+      <w:tr>
+        <w:trPr>
+          <w:trHeight w:val="458"/>
+        </w:trPr>
+        <w:tc>
+          <w:tcPr>
+            <w:tcW w:w="3106" w:type="dxa"/>
+          </w:tcPr>
+          <w:p>
+            <w:pPr>
+              <w:rPr>
+                <w:rFonts w:ascii="Arial Nova" w:hAnsi="Arial Nova" w:cs="Cascadia Mono"/>
+                <w:b/>
+                <w:bCs/>
+              </w:rPr>
+            </w:pPr>
+            <w:r>
+              <w:rPr>
+                <w:rFonts w:ascii="Arial Nova" w:hAnsi="Arial Nova" w:cs="Cascadia Mono"/>
+                <w:b/>
+                <w:bCs/>
+              </w:rPr>
+              <w:t>Terbilang</w:t>
+            </w:r>
+          </w:p>
+        </w:tc>
+        <w:tc>
+          <w:tcPr>
+            <w:tcW w:w="282" w:type="dxa"/>
+          </w:tcPr>
+          <w:p>
+            <w:pPr>
+              <w:rPr>
+                <w:rFonts w:ascii="Arial Nova" w:hAnsi="Arial Nova" w:cs="Cascadia Mono"/>
+                <w:b/>
+                <w:bCs/>
+              </w:rPr>
+            </w:pPr>
+            <w:r>
+              <w:rPr>
+                <w:rFonts w:ascii="Arial Nova" w:hAnsi="Arial Nova" w:cs="Cascadia Mono"/>
+                <w:b/>
+                <w:bCs/>
+              </w:rPr>
+              <w:t>:</w:t>
+            </w:r>
+          </w:p>
+        </w:tc>
+        <w:tc>
+          <w:tcPr>
+            <w:tcW w:w="6058" w:type="dxa"/>
+          </w:tcPr>
+          <w:p>
+            <w:pPr>
+              <w:rPr>
+                <w:rFonts w:ascii="Arial Nova" w:hAnsi="Arial Nova" w:cs="Cascadia Mono"/>
+                <w:b/>
+                <w:bCs/>
+              </w:rPr>
+            </w:pPr>
+            <w:r>
+              <w:rPr>
+                <w:rFonts w:ascii="Arial Nova" w:hAnsi="Arial Nova" w:cs="Cascadia Mono"/>
+                <w:b/>
+                <w:bCs/>
+              </w:rPr>
+              <w:t>{terbilang_nilai_kontrak}</w:t>
+            </w:r>
+          </w:p>
+        </w:tc>
+      </w:tr>
+      <w:tr>
+        <w:trPr>
+          <w:trHeight w:val="458"/>
+        </w:trPr>
+        <w:tc>
+          <w:tcPr>
+            <w:tcW w:w="3106" w:type="dxa"/>
+          </w:tcPr>
+          <w:p>
+            <w:pPr>
+              <w:rPr>
+                <w:rFonts w:ascii="Arial Nova" w:hAnsi="Arial Nova" w:cs="Cascadia Mono"/>
+                <w:b/>
+                <w:bCs/>
+              </w:rPr>
+            </w:pPr>
+            <w:r>
+              <w:rPr>
+                <w:rFonts w:ascii="Arial Nova" w:hAnsi="Arial Nova" w:cs="Cascadia Mono"/>
+                <w:b/>
+                <w:bCs/>
+              </w:rPr>
+              <w:t>Sumber Dana</w:t>
+            </w:r>
+          </w:p>
+        </w:tc>
+        <w:tc>
+          <w:tcPr>
+            <w:tcW w:w="282" w:type="dxa"/>
+          </w:tcPr>
+          <w:p>
+            <w:pPr>
+              <w:rPr>
+                <w:rFonts w:ascii="Arial Nova" w:hAnsi="Arial Nova" w:cs="Cascadia Mono"/>
+                <w:b/>
+                <w:bCs/>
+              </w:rPr>
+            </w:pPr>
+            <w:r>
+              <w:rPr>
+                <w:rFonts w:ascii="Arial Nova" w:hAnsi="Arial Nova" w:cs="Cascadia Mono"/>
+                <w:b/>
+                <w:bCs/>
+              </w:rPr>
+              <w:t>:</w:t>
+            </w:r>
+          </w:p>
+        </w:tc>
+        <w:tc>
+          <w:tcPr>
+            <w:tcW w:w="6058" w:type="dxa"/>
+          </w:tcPr>
+          <w:p>
+            <w:pPr>
+              <w:rPr>
+                <w:rFonts w:ascii="Arial Nova" w:hAnsi="Arial Nova" w:cs="Cascadia Mono"/>
+                <w:b/>
+                <w:bCs/>
+              </w:rPr>
+            </w:pPr>
+            <w:r>
+              <w:rPr>
+                <w:rFonts w:ascii="Arial Nova" w:hAnsi="Arial Nova" w:cs="Cascadia Mono"/>
+                <w:b/>
+                <w:bCs/>
+              </w:rPr>
+              <w:t>{sumber_dana}</w:t>
+            </w:r>
+          </w:p>
+        </w:tc>
+      </w:tr>
+      <w:tr>
+        <w:trPr>
+          <w:trHeight w:val="458"/>
+        </w:trPr>
+        <w:tc>
+          <w:tcPr>
+            <w:tcW w:w="3106" w:type="dxa"/>
+          </w:tcPr>
+          <w:p>
+            <w:pPr>
+              <w:rPr>
+                <w:rFonts w:ascii="Arial Nova" w:hAnsi="Arial Nova" w:cs="Cascadia Mono"/>
+                <w:b/>
+                <w:bCs/>
+              </w:rPr>
+            </w:pPr>
+            <w:r>
+              <w:rPr>
+                <w:rFonts w:ascii="Arial Nova" w:hAnsi="Arial Nova" w:cs="Cascadia Mono"/>
+                <w:b/>
+                <w:bCs/>
+              </w:rPr>
+              <w:t>Tahun Anggaran</w:t>
+            </w:r>
+          </w:p>
+        </w:tc>
+        <w:tc>
+          <w:tcPr>
+            <w:tcW w:w="282" w:type="dxa"/>
+          </w:tcPr>
+          <w:p>
+            <w:pPr>
+              <w:rPr>
+                <w:rFonts w:ascii="Arial Nova" w:hAnsi="Arial Nova" w:cs="Cascadia Mono"/>
+                <w:b/>
+                <w:bCs/>
+              </w:rPr>
+            </w:pPr>
+            <w:r>
+              <w:rPr>
+                <w:rFonts w:ascii="Arial Nova" w:hAnsi="Arial Nova" w:cs="Cascadia Mono"/>
+                <w:b/>
+                <w:bCs/>
+              </w:rPr>
+              <w:t>:</w:t>
+            </w:r>
+          </w:p>
+        </w:tc>
+        <w:tc>
+          <w:tcPr>
+            <w:tcW w:w="6058" w:type="dxa"/>
+          </w:tcPr>
+          <w:p>
+            <w:pPr>
+              <w:rPr>
+                <w:rFonts w:ascii="Arial Nova" w:hAnsi="Arial Nova" w:cs="Cascadia Mono"/>
+                <w:b/>
+                <w:bCs/>
+              </w:rPr>
+            </w:pPr>
+            <w:r>
+              <w:rPr>
+                <w:rFonts w:ascii="Arial Nova" w:hAnsi="Arial Nova" w:cs="Cascadia Mono"/>
+                <w:b/>
+                <w:bCs/>
+              </w:rPr>
+              <w:t>2026</w:t>
+            </w:r>
+          </w:p>
+        </w:tc>
+      </w:tr>
+      <w:tr>
+        <w:trPr>
+          <w:trHeight w:val="458"/>
+        </w:trPr>
+        <w:tc>
+          <w:tcPr>
+            <w:tcW w:w="3106" w:type="dxa"/>
+          </w:tcPr>
+          <w:p>
+            <w:pPr>
+              <w:rPr>
+                <w:rFonts w:ascii="Arial Nova" w:hAnsi="Arial Nova" w:cs="Cascadia Mono"/>
+                <w:b/>
+                <w:bCs/>
+              </w:rPr>
+            </w:pPr>
+            <w:r>
+              <w:rPr>
+                <w:rFonts w:ascii="Arial Nova" w:hAnsi="Arial Nova" w:cs="Cascadia Mono"/>
+                <w:b/>
+                <w:bCs/>
+              </w:rPr>
+              <w:t>Penyedia Jasa</w:t>
+            </w:r>
+          </w:p>
+        </w:tc>
+        <w:tc>
+          <w:tcPr>
+            <w:tcW w:w="282" w:type="dxa"/>
+          </w:tcPr>
+          <w:p>
+            <w:pPr>
+              <w:rPr>
+                <w:rFonts w:ascii="Arial Nova" w:hAnsi="Arial Nova" w:cs="Cascadia Mono"/>
+                <w:b/>
+                <w:bCs/>
+              </w:rPr>
+            </w:pPr>
+            <w:r>
+              <w:rPr>
+                <w:rFonts w:ascii="Arial Nova" w:hAnsi="Arial Nova" w:cs="Cascadia Mono"/>
+                <w:b/>
+                <w:bCs/>
+              </w:rPr>
+              <w:t>:</w:t>
+            </w:r>
+          </w:p>
+        </w:tc>
+        <w:tc>
+          <w:tcPr>
+            <w:tcW w:w="6058" w:type="dxa"/>
+          </w:tcPr>
+          <w:p>
+            <w:pPr>
+              <w:rPr>
+                <w:rFonts w:ascii="Arial Nova" w:hAnsi="Arial Nova" w:cs="Cascadia Mono"/>
+                <w:b/>
+                <w:bCs/>
+              </w:rPr>
+            </w:pPr>
+            <w:r>
+              <w:rPr>
+                <w:rFonts w:ascii="Arial Nova" w:hAnsi="Arial Nova" w:cs="Cascadia Mono"/>
+                <w:b/>
+                <w:bCs/>
+              </w:rPr>
+              <w:t>{nama_penyedia}</w:t>
+            </w:r>
           </w:p>
         </w:tc>
       </w:tr>
@@ -861,7 +1240,9 @@
     <w:sectPr>
       <w:pgSz w:w="12240" w:h="20160" w:code="5"/>
       <w:pgMar w:top="1920" w:right="1360" w:bottom="440" w:left="1200" w:header="0" w:footer="261" w:gutter="0"/>
+      <w:pgNumType w:start="0"/>
       <w:cols w:space="708"/>
+      <w:titlePg/>
       <w:docGrid w:linePitch="299"/>
     </w:sectPr>
   </w:body>
@@ -1268,6 +1649,7 @@
   <w:style w:type="paragraph" w:default="1" w:styleId="Normal">
     <w:name w:val="Normal"/>
     <w:qFormat/>
+    <w:rsid w:val="009E1684"/>
     <w:rPr>
       <w:lang w:val="id-ID"/>
     </w:rPr>
@@ -1474,7 +1856,6 @@
   <w:style w:type="character" w:default="1" w:styleId="DefaultParagraphFont">
     <w:name w:val="Default Paragraph Font"/>
     <w:uiPriority w:val="1"/>
-    <w:semiHidden/>
     <w:unhideWhenUsed/>
   </w:style>
   <w:style w:type="table" w:default="1" w:styleId="TableNormal">
@@ -1819,6 +2200,35 @@
         <w:insideV w:val="single" w:sz="4" w:space="0" w:color="auto"/>
       </w:tblBorders>
     </w:tblPr>
+  </w:style>
+  <w:style w:type="paragraph" w:styleId="NoSpacing">
+    <w:name w:val="No Spacing"/>
+    <w:link w:val="NoSpacingChar"/>
+    <w:uiPriority w:val="1"/>
+    <w:qFormat/>
+    <w:rsid w:val="009E1684"/>
+    <w:pPr>
+      <w:spacing w:after="0" w:line="240" w:lineRule="auto"/>
+    </w:pPr>
+    <w:rPr>
+      <w:rFonts w:eastAsiaTheme="minorEastAsia"/>
+      <w:kern w:val="0"/>
+      <w:lang w:val="en-US"/>
+      <w14:ligatures w14:val="none"/>
+    </w:rPr>
+  </w:style>
+  <w:style w:type="character" w:customStyle="1" w:styleId="NoSpacingChar">
+    <w:name w:val="No Spacing Char"/>
+    <w:basedOn w:val="DefaultParagraphFont"/>
+    <w:link w:val="NoSpacing"/>
+    <w:uiPriority w:val="1"/>
+    <w:rsid w:val="009E1684"/>
+    <w:rPr>
+      <w:rFonts w:eastAsiaTheme="minorEastAsia"/>
+      <w:kern w:val="0"/>
+      <w:lang w:val="en-US"/>
+      <w14:ligatures w14:val="none"/>
+    </w:rPr>
   </w:style>
 </w:styles>
 </file>

</xml_diff>